<commit_message>
Add author names and affiliation to the manuscript
Co-Authored-By: Claude Opus 5.5 <noreply@anthropic.com>
Claude-Session: https://claude.ai/code/session_017iXBfovQVckRmiyujQAe7s
</commit_message>
<xml_diff>
--- a/paper/manuscript.docx
+++ b/paper/manuscript.docx
@@ -87,13 +87,19 @@
         <w:pStyle w:val="Author"/>
       </w:pPr>
       <w:r>
-        <w:t xml:space="preserve">Author</w:t>
-      </w:r>
-      <w:r>
-        <w:t xml:space="preserve"> </w:t>
-      </w:r>
-      <w:r>
-        <w:t xml:space="preserve">One</w:t>
+        <w:t xml:space="preserve">Nandana</w:t>
+      </w:r>
+      <w:r>
+        <w:t xml:space="preserve"> </w:t>
+      </w:r>
+      <w:r>
+        <w:t xml:space="preserve">Narayan</w:t>
+      </w:r>
+      <w:r>
+        <w:t xml:space="preserve"> </w:t>
+      </w:r>
+      <w:r>
+        <w:t xml:space="preserve">Das</w:t>
       </w:r>
     </w:p>
     <w:p>
@@ -101,13 +107,33 @@
         <w:pStyle w:val="Author"/>
       </w:pPr>
       <w:r>
-        <w:t xml:space="preserve">Author</w:t>
-      </w:r>
-      <w:r>
-        <w:t xml:space="preserve"> </w:t>
-      </w:r>
-      <w:r>
-        <w:t xml:space="preserve">Two</w:t>
+        <w:t xml:space="preserve">Tina</w:t>
+      </w:r>
+      <w:r>
+        <w:t xml:space="preserve"> </w:t>
+      </w:r>
+      <w:r>
+        <w:t xml:space="preserve">Babu</w:t>
+      </w:r>
+    </w:p>
+    <w:p>
+      <w:pPr>
+        <w:pStyle w:val="Author"/>
+      </w:pPr>
+      <w:r>
+        <w:t xml:space="preserve">Rekha</w:t>
+      </w:r>
+      <w:r>
+        <w:t xml:space="preserve"> </w:t>
+      </w:r>
+      <w:r>
+        <w:t xml:space="preserve">R</w:t>
+      </w:r>
+      <w:r>
+        <w:t xml:space="preserve"> </w:t>
+      </w:r>
+      <w:r>
+        <w:t xml:space="preserve">Nair</w:t>
       </w:r>
     </w:p>
     <w:p>

</xml_diff>